<commit_message>
docs: center product story on dual taskmasters
</commit_message>
<xml_diff>
--- a/docs/product/Pocket_Buddy_终极产品文档_v1.0.docx
+++ b/docs/product/Pocket_Buddy_终极产品文档_v1.0.docx
@@ -12,7 +12,7 @@
         <w:pStyle w:val="PBKicker"/>
       </w:pPr>
       <w:r>
-        <w:t>GOOGLE TASKMASTER · PRODUCT &amp; ARCHITECTURE</w:t>
+        <w:t>GOOGLE ALL THINGS AGENTIC · THE TASKMASTER TRACK</w:t>
       </w:r>
     </w:p>
     <w:p>
@@ -40,7 +40,7 @@
           <w:b/>
           <w:color w:val="17201D"/>
         </w:rPr>
-        <w:t>终极产品文档</w:t>
+        <w:t>双层 Taskmaster · 终极产品文档</w:t>
       </w:r>
     </w:p>
     <w:p>
@@ -55,7 +55,7 @@
           <w:color w:val="56635E"/>
           <w:sz w:val="24"/>
         </w:rPr>
-        <w:t>用户能组装自己的 Skill，Frost 能把它可靠地跑完。</w:t>
+        <w:t>Agent Taskmaster 管目标与角色，Skill Taskmaster 把用户画布跑成真正的任务。</w:t>
       </w:r>
     </w:p>
     <w:p>
@@ -189,7 +189,7 @@
           <w:color w:val="17201D"/>
           <w:sz w:val="21"/>
         </w:rPr>
-        <w:t>Pocket Buddy 是以运动、恢复、营养和真实世界观察为主线的私人 Agent：用户面对一个 Frost，后台通过可组合 Skill、轻量 Harness 和 Taskmaster，把目标变成可执行、可中断、可恢复、可验证的行动。</w:t>
+        <w:t>Pocket Buddy 是以运动、恢复、营养和真实世界观察为主线的私人 Agent：Agent Taskmaster 负责理解目标并调度专业 Agent，Skill Taskmaster 则把用户组合的能力积木编译并可靠运行成真正的多步骤任务。</w:t>
       </w:r>
     </w:p>
     <w:p>
@@ -209,7 +209,7 @@
         <w:pStyle w:val="Heading2"/>
       </w:pPr>
       <w:r>
-        <w:t>三层 Taskmaster 主线</w:t>
+        <w:t>双层 Taskmaster：一个管“谁来做”，一个管“怎么做”</w:t>
       </w:r>
     </w:p>
     <w:p>
@@ -223,19 +223,10 @@
       <w:r>
         <w:rPr>
           <w:rFonts w:ascii="Arial Unicode MS" w:hAnsi="Arial Unicode MS" w:eastAsia="Arial Unicode MS" w:cs="Arial Unicode MS"/>
-          <w:b/>
           <w:color w:val="17201D"/>
           <w:sz w:val="22"/>
         </w:rPr>
-        <w:t>Frost Harness 管目标：</w:t>
-      </w:r>
-      <w:r>
-        <w:rPr>
-          <w:rFonts w:ascii="Arial Unicode MS" w:hAnsi="Arial Unicode MS" w:eastAsia="Arial Unicode MS" w:cs="Arial Unicode MS"/>
-          <w:color w:val="17201D"/>
-          <w:sz w:val="22"/>
-        </w:rPr>
-        <w:t>理解意图、选择最短且安全的路径，决定继续、等待、追问、委派或停止。</w:t>
+        <w:t>Agent Taskmaster / Frost Harness 管目标与角色：主 Agent 维持 Goal，调度专业子 Agent，决定继续、等待、追问、委派、恢复或停止。</w:t>
       </w:r>
     </w:p>
     <w:p>
@@ -249,45 +240,64 @@
       <w:r>
         <w:rPr>
           <w:rFonts w:ascii="Arial Unicode MS" w:hAnsi="Arial Unicode MS" w:eastAsia="Arial Unicode MS" w:cs="Arial Unicode MS"/>
-          <w:b/>
           <w:color w:val="17201D"/>
           <w:sz w:val="22"/>
         </w:rPr>
-        <w:t>Skill Taskmaster 跑图：</w:t>
+        <w:t>Skill Taskmaster / Graph Runtime 管步骤与执行：把用户在 Canvas 组合的能力积木结构化、校验并编译为 Skill Graph，再处理依赖、分支、暂停、重试、取消、Signal 和 Evidence。</w:t>
+      </w:r>
+    </w:p>
+    <w:p>
+      <w:pPr>
+        <w:spacing w:before="100" w:after="200" w:line="288" w:lineRule="auto"/>
+        <w:ind w:left="216" w:right="115"/>
+        <w:shd w:val="clear" w:fill="F3EFFF"/>
+        <w:pBdr>
+          <w:left w:val="single" w:sz="22" w:space="8" w:color="7658AD"/>
+        </w:pBdr>
+      </w:pPr>
+      <w:r>
+        <w:rPr>
+          <w:rFonts w:ascii="Arial Unicode MS" w:hAnsi="Arial Unicode MS" w:eastAsia="Arial Unicode MS" w:cs="Arial Unicode MS"/>
+          <w:b/>
+          <w:color w:val="7658AD"/>
+          <w:sz w:val="21"/>
+        </w:rPr>
+        <w:t xml:space="preserve">核心差异化  </w:t>
       </w:r>
       <w:r>
         <w:rPr>
           <w:rFonts w:ascii="Arial Unicode MS" w:hAnsi="Arial Unicode MS" w:eastAsia="Arial Unicode MS" w:cs="Arial Unicode MS"/>
           <w:color w:val="17201D"/>
-          <w:sz w:val="22"/>
+          <w:sz w:val="21"/>
         </w:rPr>
-        <w:t>可靠执行 Canvas 生成的 Skill Graph，处理依赖、分支、暂停、重试、取消和 Signal。</w:t>
+        <w:t>多数 Agent 平台让开发者预先写好工作流；Pocket Buddy 进一步让普通用户先自由 Sketch，再由系统一键结构化并交给 Skill Taskmaster 可靠跑通。画布不是展示层，而是用户创造真实 Agent 工作流的入口。</w:t>
       </w:r>
     </w:p>
     <w:p>
       <w:pPr>
-        <w:spacing w:after="80" w:line="300" w:lineRule="auto"/>
-        <w:numPr>
-          <w:ilvl w:val="0"/>
-          <w:numId w:val="10"/>
-        </w:numPr>
+        <w:spacing w:before="100" w:after="200" w:line="288" w:lineRule="auto"/>
+        <w:ind w:left="216" w:right="115"/>
+        <w:shd w:val="clear" w:fill="F3FBF7"/>
+        <w:pBdr>
+          <w:left w:val="single" w:sz="22" w:space="8" w:color="0B6B50"/>
+        </w:pBdr>
       </w:pPr>
       <w:r>
         <w:rPr>
           <w:rFonts w:ascii="Arial Unicode MS" w:hAnsi="Arial Unicode MS" w:eastAsia="Arial Unicode MS" w:cs="Arial Unicode MS"/>
           <w:b/>
-          <w:color w:val="17201D"/>
-          <w:sz w:val="22"/>
+          <w:color w:val="0B6B50"/>
+          <w:sz w:val="21"/>
         </w:rPr>
-        <w:t>Health Taskmaster 交事实：</w:t>
+        <w:t xml:space="preserve">健康事实边界  </w:t>
       </w:r>
       <w:r>
         <w:rPr>
           <w:rFonts w:ascii="Arial Unicode MS" w:hAnsi="Arial Unicode MS" w:eastAsia="Arial Unicode MS" w:cs="Arial Unicode MS"/>
           <w:color w:val="17201D"/>
-          <w:sz w:val="22"/>
+          <w:sz w:val="21"/>
         </w:rPr>
-        <w:t>健康事实与设备副作用只能通过幂等 Effect 和 Health Event 提交。</w:t>
+        <w:t>Health Fact &amp; Effect Boundary 不是第三种 Taskmaster。它只负责以幂等 Effect 和 Health Event 提交健康事实与设备副作用，作为双层 Taskmaster 下方的安全执行边界。</w:t>
       </w:r>
     </w:p>
     <w:p>
@@ -2858,7 +2868,7 @@
       <w:r>
         <w:drawing>
           <wp:inline xmlns:a="http://schemas.openxmlformats.org/drawingml/2006/main" xmlns:pic="http://schemas.openxmlformats.org/drawingml/2006/picture">
-            <wp:extent cx="5852160" cy="1136007"/>
+            <wp:extent cx="5852160" cy="1136294"/>
             <wp:docPr id="3" name="Picture 3" descr="用户想法和能力积木进入 Skill Canvas，经结构化、权限校验后由 Skill Taskmaster 运行的流程图"/>
             <wp:cNvGraphicFramePr>
               <a:graphicFrameLocks noChangeAspect="1"/>
@@ -2879,7 +2889,7 @@
                   <pic:spPr>
                     <a:xfrm>
                       <a:off x="0" y="0"/>
-                      <a:ext cx="5852160" cy="1136007"/>
+                      <a:ext cx="5852160" cy="1136294"/>
                     </a:xfrm>
                     <a:prstGeom prst="rect"/>
                   </pic:spPr>
@@ -3060,7 +3070,7 @@
         <w:pStyle w:val="Heading1"/>
       </w:pPr>
       <w:r>
-        <w:t>7. Frost 真正 Agent：Model + Harness</w:t>
+        <w:t>7. 双层 Taskmaster：Agent 编排 + Skill 图执行</w:t>
       </w:r>
     </w:p>
     <w:p>
@@ -3073,7 +3083,7 @@
         <w:drawing>
           <wp:inline xmlns:a="http://schemas.openxmlformats.org/drawingml/2006/main" xmlns:pic="http://schemas.openxmlformats.org/drawingml/2006/picture">
             <wp:extent cx="5897880" cy="2801493"/>
-            <wp:docPr id="4" name="Picture 4" descr="Frost Agent Loop、Tool Runtime、Skill Taskmaster、Health Taskmaster、Session Log 和 Goal Driver 架构图"/>
+            <wp:docPr id="4" name="Picture 4" descr="Agent Taskmaster、Skill Taskmaster、Tool Runtime、Health Fact and Effect Boundary、Session Log 和 Goal Driver 架构图"/>
             <wp:cNvGraphicFramePr>
               <a:graphicFrameLocks noChangeAspect="1"/>
             </wp:cNvGraphicFramePr>
@@ -3110,7 +3120,7 @@
         <w:keepNext w:val="0"/>
       </w:pPr>
       <w:r>
-        <w:t>图 3｜Frost 轻量 Harness、Skill Taskmaster 与 Health Taskmaster 的职责边界。</w:t>
+        <w:t>图 3｜Agent Taskmaster 管目标与子 Agent；Skill Taskmaster 编译并运行用户的 Skill Graph。</w:t>
       </w:r>
     </w:p>
     <w:p>
@@ -3122,7 +3132,7 @@
           <w:color w:val="17201D"/>
           <w:sz w:val="22"/>
         </w:rPr>
-        <w:t>Qwen 等模型只提出 Candidate NextAction；Harness 决定系统是否可持续行动、可中断、可恢复和可审计。一次用户目标是 Turn，一次“决策 + 工具 + 结果观察”是 Step；一个 Turn 可以连续运行多个 Step。</w:t>
+        <w:t>Agent Taskmaster 是 Frost 的目标级 Harness：模型只提出 Candidate NextAction，主 Agent 决定是否继续、委派、等待、恢复或停止。Skill Taskmaster 是工作流级编译器与运行时：它把用户画布转成可执行 Skill Graph，并可靠完成多步骤任务。一次用户目标是 Turn，一次“决策 + 工具 + 结果观察”是 Step。</w:t>
       </w:r>
     </w:p>
     <w:p>
@@ -3181,7 +3191,7 @@
           <w:color w:val="17201D"/>
           <w:sz w:val="22"/>
         </w:rPr>
-        <w:t>模型、专业 Agent 和 Skill 只能提交候选动作或 Proposal，不能绕过 Tool Runtime 和 Taskmaster。</w:t>
+        <w:t>模型、专业 Agent 和 Skill 只能提交候选动作或 Proposal，不能绕过 Tool Runtime 与 Health Fact &amp; Effect Boundary。</w:t>
       </w:r>
     </w:p>
     <w:p>
@@ -3858,7 +3868,7 @@
           <w:color w:val="17201D"/>
           <w:sz w:val="21"/>
         </w:rPr>
-        <w:t>Agent 可以代表用户发起权限申请，但不能替用户同意。Prompt 中的“禁止”不是安全边界；真正的安全必须由 Runtime、Capability Broker、Taskmaster 与存储隔离强制执行。</w:t>
+        <w:t>Agent 可以代表用户发起权限申请，但不能替用户同意。Prompt 中的“禁止”不是安全边界；真正的安全必须由 Runtime、Capability Broker、双层 Taskmaster、Health Fact &amp; Effect Boundary 与存储隔离共同强制执行。</w:t>
       </w:r>
     </w:p>
     <w:p>
@@ -4738,7 +4748,7 @@
                 <w:color w:val="17201D"/>
                 <w:sz w:val="17"/>
               </w:rPr>
-              <w:t>Taskmaster、Skill Router、Effect Ledger、Trace；Session Log、Inbox、Agent Loop、Tool Runtime、Goal Driver；Action Map；Her Motion 摄像头兜底；健康 Skill 合同；Qwen 部署与端侧适配</w:t>
+              <w:t>Agent Taskmaster / Frost Harness 基线、Skill Router、Effect Ledger、Trace；Session Log、Inbox、Agent Loop、Tool Runtime、Goal Driver；Action Map；Her Motion 摄像头兜底；健康 Skill 合同；Qwen 部署与端侧适配</w:t>
             </w:r>
           </w:p>
         </w:tc>
@@ -5230,7 +5240,7 @@
         <w:pStyle w:val="Heading1"/>
       </w:pPr>
       <w:r>
-        <w:t>11. 现场 Demo：让 Taskmaster 真正跑通用户自定义 Skill</w:t>
+        <w:t>11. 现场 Demo：让双层 Taskmaster 跑通用户自定义 Skill</w:t>
       </w:r>
     </w:p>
     <w:p>
@@ -5308,7 +5318,7 @@
           <w:color w:val="17201D"/>
           <w:sz w:val="22"/>
         </w:rPr>
-        <w:t>Harness 创建 Goal，Skill Taskmaster 依次执行多个节点，不要求每一步再次点击“运行”。</w:t>
+        <w:t>Agent Taskmaster 创建并维持 Goal，Skill Taskmaster 编译、校验并依次执行多个节点，不要求每一步再次点击“运行”。</w:t>
       </w:r>
     </w:p>
     <w:p>
@@ -5571,7 +5581,7 @@
           <w:color w:val="17201D"/>
           <w:sz w:val="21"/>
         </w:rPr>
-        <w:t>Pocket Buddy 是一个能被用户重新组装的运动健康 Agent：用户在 Skill Canvas 中创造能力组合，Frost Harness 理解目标，Skill Taskmaster 可靠运行流程，Health Taskmaster 用证据守住健康事实。</w:t>
+        <w:t>Pocket Buddy 是一个能被用户重新组装的运动健康 Agent：Agent Taskmaster 让主 Agent 持续理解目标并调度专业 Agent；Skill Taskmaster 把用户在 Canvas 组合的能力积木编译并可靠运行成真实多步骤任务。</w:t>
       </w:r>
     </w:p>
     <w:p>
@@ -5623,7 +5633,7 @@
           <w:color w:val="17201D"/>
           <w:sz w:val="22"/>
         </w:rPr>
-        <w:t>这个产品最有力量的地方，不是后台堆了多少个 Agent，也不是让每次执行强制多跳一层，而是 Frost 能选择最短且安全的行动路径；同时，用户第一次可以把“做 Skill”本身变成可视化创作，再让 Taskmaster 真正把它跑通。</w:t>
+        <w:t>双层 Taskmaster 是产品真正的技术核心：Agent Taskmaster 解决“主 Agent 如何持续工作并调度谁来做”，Skill Taskmaster 解决“普通用户组合出来的 Skill 如何被编译、校验并可靠跑通”。后一层把 Skill 创作从技术叙事变成了可现场证明的执行能力。</w:t>
       </w:r>
     </w:p>
     <w:p>
@@ -5650,7 +5660,7 @@
           <w:color w:val="17201D"/>
           <w:sz w:val="21"/>
         </w:rPr>
-        <w:t>一个 Frost，一张可组合的能力画布，一条可验证的真实行动闭环。</w:t>
+        <w:t>一个 Frost，两层 Taskmaster，一张可组合的能力画布，一条可验证的真实行动闭环。</w:t>
       </w:r>
     </w:p>
     <w:p>

</xml_diff>